<commit_message>
Tiefgang-Korrektur Teil 1: Ich stand nie, Wenn Beziehungen erschöpfen, Das schlechte Gewissen
Aus dem doppelten Lektorat (Tiefgang/Titeltreue-Check, 17.10.2026): gezielte
Ergänzungen an den konvergent gefundenen flachen Stellen, geschützte starke
Passagen unangetastet. Fachjargon ("Nervensystem", "Psychologie", Bowlby/
Ainsworth-Zitate) durchgängig in Körper-/Alltagsbilder übersetzt, ausser in
den gesetzlich vorgeschriebenen Haftungsausschluss-Absätzen (dort korrekt
und Pflicht). Bei "Das schlechte Gewissen" zusätzlich: Therapiesitzungs-
Anmutung und Fachautoritäten-Zitate raus (Rechtssicherheit, Coachin statt
Therapeutin). buch-pruefen.py sauber, keine neuen Befunde.

Co-Authored-By: Claude Sonnet 5 <noreply@anthropic.com>
Claude-Session: https://claude.ai/code/session_011oFtWvyjvkDdc6K2GcSXHx
</commit_message>
<xml_diff>
--- a/outputs/buch-an-mich-denken/buch4-MANUSKRIPT.docx
+++ b/outputs/buch-an-mich-denken/buch4-MANUSKRIPT.docx
@@ -856,7 +856,7 @@
         </w:rPr>
       </w:pPr>
       <w:r>
-        <w:t>Der Selbsttest dauert zwei Minuten. Die Notfall-Seiten sind für die Tage, an denen gar nichts geht. Und am Ende hast du einen Plan mit einem einzigen Schritt pro Woche.</w:t>
+        <w:t>Der Selbsttest dauert zwei Minuten. Die Notfall-Seiten sind für die Tage, an denen gar nichts geht. Und zum Schluss hast du einen Plan mit einem einzigen Schritt pro Woche. Am Ende dieses Buchs wartet zusätzlich ein kostenloses Bonus-PDF mit vertiefenden Übungen auf dich, als Dankeschön fürs Lesen.</w:t>
       </w:r>
     </w:p>
     <w:p>
@@ -1915,7 +1915,7 @@
           <w:b w:val="0"/>
           <w:i w:val="0"/>
         </w:rPr>
-        <w:t>Was in dir wirklich passiert: Diese Fähigkeit, fremde Bedürfnisse blitzschnell zu erkennen, entwickelt sich meist in einer Umgebung, in der genaues Hinspüren notwendig war, um Konflikte oder Enttäuschung zu vermeiden. Das Nervensystem lernt, zuerst nach aussen zu scannen, noch bevor es nach innen schaut. Diese Reihenfolge lässt sich mit der Zeit umlernen, aber nicht durch reinen Vorsatz, sondern durch viele kleine, wiederholte Erfahrungen, bei denen die eigene Wahrnehmung zuerst kommt.</w:t>
+        <w:t>Was in dir wirklich passiert: Diese Fähigkeit, fremde Bedürfnisse blitzschnell zu erkennen, entwickelt sich meist in einer Umgebung, in der genaues Hinspüren notwendig war, um Konflikte oder Enttäuschung zu vermeiden. Ein Teil von dir lernt, zuerst nach aussen zu scannen, noch bevor er nach innen schaut. Diese Reihenfolge lässt sich mit der Zeit umlernen, aber nicht durch reinen Vorsatz, sondern durch viele kleine, wiederholte Erfahrungen, bei denen die eigene Wahrnehmung zuerst kommt.</w:t>
       </w:r>
     </w:p>
     <w:p>
@@ -2419,7 +2419,7 @@
           <w:b w:val="0"/>
           <w:i w:val="0"/>
         </w:rPr>
-        <w:t>Was in dir wirklich passiert: Ein abgeschlossenes Auto ist für viele Menschen mit diesem Muster einer der wenigen Orte, an denen niemand etwas von ihnen erwartet oder beobachtet. Diese kurze, erzwungene Privatheit erlaubt es dem Nervensystem, für einen Moment die ständige Wachsamkeit fallen zu lassen. Das ist kein Zufall, sondern ein Hinweis darauf, wie selten dieser Zustand sonst im Alltag vorkommt.</w:t>
+        <w:t>Was in dir wirklich passiert: Ein abgeschlossenes Auto ist für viele Menschen mit diesem Muster einer der wenigen Orte, an denen niemand etwas von ihnen erwartet oder beobachtet. Diese kurze, erzwungene Privatheit erlaubt es dir, für einen Moment die ständige Wachsamkeit fallen zu lassen. Das ist kein Zufall, sondern ein Hinweis darauf, wie selten dieser Zustand sonst im Alltag vorkommt.</w:t>
       </w:r>
     </w:p>
     <w:p>
@@ -2652,7 +2652,7 @@
         </w:rPr>
       </w:pPr>
       <w:r>
-        <w:t>Ein Nervensystem, das dauerhaft auf Anspannung gestellt ist, weil es ständig für andere mitdenkt, findet selten den Weg zurück in echte Entspannung. Selbst wenn objektiv Ruhe herrscht. Der Körper hat verlernt, den Unterschied zwischen wirklicher Gefahr und einem ruhigen Sonntagnachmittag zu spüren, weil er über Jahre dieselbe Alarmbereitschaft für beides gehalten hat.</w:t>
+        <w:t>Ein Teil von dir, der dauerhaft auf Anspannung gestellt ist, weil er ständig für andere mitdenkt, findet selten den Weg zurück in echte Entspannung. Selbst wenn objektiv Ruhe herrscht. Der Körper hat verlernt, den Unterschied zwischen wirklicher Gefahr und einem ruhigen Sonntagnachmittag zu spüren, weil er über Jahre dieselbe Alarmbereitschaft für beides gehalten hat.</w:t>
       </w:r>
     </w:p>
     <w:p>
@@ -3937,7 +3937,7 @@
           <w:b w:val="0"/>
           <w:i w:val="0"/>
         </w:rPr>
-        <w:t>Was in dir wirklich passiert: Einseitige Freundschaften entstehen selten aus böser Absicht, sondern weil eine Seite sich ans Geben gewöhnt hat und die andere sich an das Nehmen. Diese Verteilung verändert sich fast nie von selbst, sie muss aktiv angesprochen oder durch neues Verhalten verschoben werden.</w:t>
+        <w:t>Was in dir wirklich passiert: Einseitige Freundschaften entstehen selten aus böser Absicht, sondern weil eine Seite sich ans Geben gewöhnt hat und die andere sich an das Nehmen. Diese Verteilung verändert sich fast nie von selbst, sie muss aktiv angesprochen oder durch neues Verhalten verschoben werden. Das Muster aus den ersten Kapiteln spielt hier mit: Dein Blick geht zuerst nach aussen, lange bevor du merkst, was bei dir selbst gerade fehlt. In einer Freundschaft heisst das: Du springst in die Lücke, bevor die andere Person überhaupt merkt, dass da eine war. Deshalb landest ausgerechnet du in der gebenden Rolle, weil dein Sensor einfach schneller ist.</w:t>
       </w:r>
     </w:p>
     <w:p>
@@ -4694,7 +4694,7 @@
           <w:b w:val="0"/>
           <w:i w:val="0"/>
         </w:rPr>
-        <w:t>Was in dir wirklich passiert: Pflege verlangt reale, oft grosse Aufopferung, aber sie rechtfertigt nicht automatisch das völlige Verschwinden der eigenen Bedürfnisse. Wer sich in der Pflege komplett selbst zurückstellt, wird auf Dauer weniger tragfähig, nicht mehr.</w:t>
+        <w:t>Was in dir wirklich passiert: Bei der Familie wird nie nachgerechnet. Bei dir selbst rechnest du schon nach, bevor überhaupt jemand fragt. Du legst dir die Begründung zurecht, noch während das Geld in der Tasche steckt. Das hat nichts mit Sparsamkeit zu tun. Es ist dieselbe alte Reihenfolge wie überall sonst im Buch: Dein Teil zählt zuletzt, auch in Franken.</w:t>
       </w:r>
     </w:p>
     <w:p>
@@ -5065,7 +5065,7 @@
         </w:rPr>
       </w:pPr>
       <w:r>
-        <w:t>Sie legt sich als eine Art Grundmüdigkeit über alles andere.</w:t>
+        <w:t>Sie legt sich als eine Art Grundmüdigkeit über alles andere. Auf deiner eigenen Liste würde dieser Verlust ganz oben stehen, nicht irgendwo zwischen Einkauf und Terminen.</w:t>
       </w:r>
     </w:p>
     <w:p>
@@ -5135,7 +5135,7 @@
           <w:b w:val="0"/>
           <w:i w:val="0"/>
         </w:rPr>
-        <w:t>Was in dir wirklich passiert: Alte, jahrzehntelang eingeübte Muster sind im Nervensystem stärker verankert als neue Verhaltensweisen, besonders unter Stress greift der Kopf bevorzugt auf das Vertraute zurück. Ein Rückfall zeigt deshalb nicht, dass nichts gelernt wurde, sondern nur, dass das neue Verhalten noch mehr Wiederholung braucht.</w:t>
+        <w:t>Was in dir wirklich passiert: Alte, jahrzehntelang eingeübte Muster sitzen im Körper tiefer als neue Verhaltensweisen, besonders unter Stress greift der Kopf bevorzugt auf das Vertraute zurück. Ein Rückfall zeigt deshalb nicht, dass nichts gelernt wurde, sondern nur, dass das neue Verhalten noch mehr Wiederholung braucht.</w:t>
       </w:r>
     </w:p>
     <w:p>
@@ -5979,7 +5979,7 @@
           <w:b w:val="0"/>
           <w:i w:val="0"/>
         </w:rPr>
-        <w:t>Es gibt einen Unterschied zwischen etwas aus Liebe tun und etwas tun, weil es sich anfühlt, als hätte man keine Wahl. Von aussen sehen beide Handlungen manchmal gleich aus. Von innen fühlen sie sich völlig verschieden an.</w:t>
+        <w:t>Es gibt einen Unterschied zwischen etwas aus Liebe tun und etwas tun, weil es sich anfühlt, als hätte man keine Wahl. Von aussen sehen beide Handlungen manchmal gleich aus. Von innen fühlen sie sich völlig verschieden an. Genau das wäre der Eintrag auf deiner eigenen Liste: nicht ob die Aufgabe erledigt ist, sondern ob sie sich wie deine eigene anfühlt.</w:t>
       </w:r>
     </w:p>
     <w:p>
@@ -6291,7 +6291,7 @@
           <w:b w:val="0"/>
           <w:i w:val="0"/>
         </w:rPr>
-        <w:t>Hilfe anzunehmen ist keine Schwäche und auch keine Schuld. Es ist ein Übungsfeld wie jedes andere, das in diesem Buch beschrieben wird, mit demselben Muskel, der auch beim Neinsagen gebraucht wird.</w:t>
+        <w:t>Hilfe anzunehmen ist keine Schwäche und auch keine Schuld. Es ist ein Übungsfeld wie jedes andere, das in diesem Buch beschrieben wird, mit demselben Muskel, der auch beim Neinsagen gebraucht wird. Und genau das gehört auf deine eigene Liste: nicht nur, was du gibst, sondern auch, wem du erlaubst, etwas für dich zu tun.</w:t>
       </w:r>
     </w:p>
     <w:p>
@@ -6305,7 +6305,7 @@
           <w:b w:val="0"/>
           <w:i w:val="0"/>
         </w:rPr>
-        <w:t>Was in dir wirklich passiert: Wer gewohnt ist, die Rolle der Helferin oder des Helfers einzunehmen, empfindet die umgekehrte Rolle oft als Statusverlust, obwohl objektiv nichts verloren geht. Diese Bewertung ist erlernt und kann genauso wieder verlernt werden.</w:t>
+        <w:t>Was in dir wirklich passiert: Wer gewohnt ist, die Rolle der Helferin oder des Helfers einzunehmen, empfindet die umgekehrte Rolle oft als Statusverlust, obwohl objektiv nichts verloren geht. Wer sich jahrelang um alle kümmert, definiert sich genau darüber: zuverlässig, stark, die Adresse, an die sich alle wenden. Hilfe anzunehmen dreht diese Reihenfolge für einen Moment um, und dein Körper kennt dich in dieser neuen Rolle schlicht noch nicht. Das fühlt sich an wie Boden, der kurz wegklappt, nicht weil wirklich etwas fehlt, sondern weil du dich all die Jahre nur im Stehen erlebt hast. Diese Bewertung ist erlernt und kann genauso wieder verlernt werden.</w:t>
       </w:r>
     </w:p>
     <w:p>

</xml_diff>